<commit_message>
Remove duplicate guide folder and product-spec copies; regenerate file guides
</commit_message>
<xml_diff>
--- a/DOTE6751_LinkedIn/File_Guide.docx
+++ b/DOTE6751_LinkedIn/File_Guide.docx
@@ -96,19 +96,15 @@
         </w:rPr>
         <w:t>DOTE6751_LinkedIn/</w:t>
         <w:br/>
+        <w:t xml:space="preserve">  File_Guide.docx   (42 KB)</w:t>
+        <w:br/>
+        <w:t xml:space="preserve">  File_Guide.pdf   (199 KB)</w:t>
+        <w:br/>
         <w:t xml:space="preserve">  File_Guide_CN.docx   (43 KB)</w:t>
         <w:br/>
+        <w:t xml:space="preserve">  File_Guide_CN.pdf   (394 KB)</w:t>
+        <w:br/>
         <w:t xml:space="preserve">  README.md   (1 KB)</w:t>
-        <w:br/>
-        <w:t xml:space="preserve">  File_Guide/</w:t>
-        <w:br/>
-        <w:t xml:space="preserve">    File_Guide.docx   (42 KB)</w:t>
-        <w:br/>
-        <w:t xml:space="preserve">    File_Guide.pdf   (201 KB)</w:t>
-        <w:br/>
-        <w:t xml:space="preserve">    File_Guide_CN.docx   (43 KB)</w:t>
-        <w:br/>
-        <w:t xml:space="preserve">    File_Guide_CN.pdf   (396 KB)</w:t>
         <w:br/>
         <w:t xml:space="preserve">  Product_Spec/</w:t>
         <w:br/>
@@ -157,14 +153,6 @@
         <w:t xml:space="preserve">    Entity_Relationship_Catalog.md   (13 KB)</w:t>
         <w:br/>
         <w:t xml:space="preserve">    Normalization_Proof.xlsx   (29 KB)</w:t>
-        <w:br/>
-        <w:t xml:space="preserve">    Product_Spec_CN.docx   (42 KB)</w:t>
-        <w:br/>
-        <w:t xml:space="preserve">    Product_Spec_CN.md   (8 KB)</w:t>
-        <w:br/>
-        <w:t xml:space="preserve">    Product_Spec_EN.docx   (41 KB)</w:t>
-        <w:br/>
-        <w:t xml:space="preserve">    Product_Spec_EN.md   (8 KB)</w:t>
         <w:br/>
         <w:t xml:space="preserve">    Relational_Schema.md   (11 KB)</w:t>
         <w:br/>
@@ -278,7 +266,7 @@
         <w:br/>
         <w:t xml:space="preserve">    06_checks.sql   (5 KB)</w:t>
         <w:br/>
-        <w:t xml:space="preserve">    linkedin_db_full.sql   (273 KB)</w:t>
+        <w:t xml:space="preserve">    linkedin_db_full.sql   (274 KB)</w:t>
       </w:r>
     </w:p>
     <w:p>
@@ -425,7 +413,7 @@
                 <w:rFonts w:ascii="Calibri" w:hAnsi="Calibri" w:eastAsia="Calibri"/>
                 <w:sz w:val="17"/>
               </w:rPr>
-              <w:t>File_Guide_CN.docx</w:t>
+              <w:t>File_Guide.docx</w:t>
             </w:r>
           </w:p>
         </w:tc>
@@ -440,7 +428,7 @@
                 <w:rFonts w:ascii="Calibri" w:hAnsi="Calibri" w:eastAsia="Calibri"/>
                 <w:sz w:val="17"/>
               </w:rPr>
-              <w:t>43 KB</w:t>
+              <w:t>42 KB</w:t>
             </w:r>
           </w:p>
         </w:tc>
@@ -487,7 +475,7 @@
                 <w:rFonts w:ascii="Calibri" w:hAnsi="Calibri" w:eastAsia="Calibri"/>
                 <w:sz w:val="17"/>
               </w:rPr>
-              <w:t>README.md</w:t>
+              <w:t>File_Guide.pdf</w:t>
             </w:r>
           </w:p>
         </w:tc>
@@ -502,7 +490,7 @@
                 <w:rFonts w:ascii="Calibri" w:hAnsi="Calibri" w:eastAsia="Calibri"/>
                 <w:sz w:val="17"/>
               </w:rPr>
-              <w:t>1 KB</w:t>
+              <w:t>199 KB</w:t>
             </w:r>
           </w:p>
         </w:tc>
@@ -517,7 +505,7 @@
                 <w:rFonts w:ascii="Calibri" w:hAnsi="Calibri" w:eastAsia="Calibri"/>
                 <w:sz w:val="17"/>
               </w:rPr>
-              <w:t>Quick orientation</w:t>
+              <w:t>—</w:t>
             </w:r>
           </w:p>
         </w:tc>
@@ -532,117 +520,7 @@
                 <w:rFonts w:ascii="Calibri" w:hAnsi="Calibri" w:eastAsia="Calibri"/>
                 <w:sz w:val="17"/>
               </w:rPr>
-              <w:t>Three sentences on what the package is and where to start.</w:t>
-            </w:r>
-          </w:p>
-        </w:tc>
-      </w:tr>
-    </w:tbl>
-    <w:p>
-      <w:pPr>
-        <w:spacing w:after="40"/>
-      </w:pPr>
-    </w:p>
-    <w:p>
-      <w:pPr>
-        <w:keepNext/>
-        <w:spacing w:before="200" w:after="60"/>
-      </w:pPr>
-      <w:r>
-        <w:rPr>
-          <w:rFonts w:ascii="Calibri" w:hAnsi="Calibri" w:eastAsia="Calibri"/>
-          <w:b/>
-          <w:color w:val="0E2A47"/>
-          <w:sz w:val="23"/>
-        </w:rPr>
-        <w:t>File_Guide/</w:t>
-      </w:r>
-    </w:p>
-    <w:tbl>
-      <w:tblPr>
-        <w:tblStyle w:val="TableGrid"/>
-        <w:tblW w:type="auto" w:w="0"/>
-        <w:jc w:val="center"/>
-        <w:tblLayout w:type="fixed"/>
-        <w:tblLook w:firstColumn="1" w:firstRow="1" w:lastColumn="0" w:lastRow="0" w:noHBand="0" w:noVBand="1" w:val="04A0"/>
-        <w:tblLayout w:type="fixed"/>
-      </w:tblPr>
-      <w:tblGrid>
-        <w:gridCol w:w="3061"/>
-        <w:gridCol w:w="737"/>
-        <w:gridCol w:w="2268"/>
-        <w:gridCol w:w="4479"/>
-      </w:tblGrid>
-      <w:tr>
-        <w:tc>
-          <w:tcPr>
-            <w:tcW w:type="dxa" w:w="3061"/>
-            <w:shd w:val="clear" w:fill="0E2A47"/>
-          </w:tcPr>
-          <w:p>
-            <w:r/>
-            <w:r>
-              <w:rPr>
-                <w:rFonts w:ascii="Calibri" w:hAnsi="Calibri" w:eastAsia="Calibri"/>
-                <w:b/>
-                <w:color w:val="FFFFFF"/>
-                <w:sz w:val="17"/>
-              </w:rPr>
-              <w:t>File</w:t>
-            </w:r>
-          </w:p>
-        </w:tc>
-        <w:tc>
-          <w:tcPr>
-            <w:tcW w:type="dxa" w:w="737"/>
-            <w:shd w:val="clear" w:fill="0E2A47"/>
-          </w:tcPr>
-          <w:p>
-            <w:r/>
-            <w:r>
-              <w:rPr>
-                <w:rFonts w:ascii="Calibri" w:hAnsi="Calibri" w:eastAsia="Calibri"/>
-                <w:b/>
-                <w:color w:val="FFFFFF"/>
-                <w:sz w:val="17"/>
-              </w:rPr>
-              <w:t>Size</w:t>
-            </w:r>
-          </w:p>
-        </w:tc>
-        <w:tc>
-          <w:tcPr>
-            <w:tcW w:type="dxa" w:w="2268"/>
-            <w:shd w:val="clear" w:fill="0E2A47"/>
-          </w:tcPr>
-          <w:p>
-            <w:r/>
-            <w:r>
-              <w:rPr>
-                <w:rFonts w:ascii="Calibri" w:hAnsi="Calibri" w:eastAsia="Calibri"/>
-                <w:b/>
-                <w:color w:val="FFFFFF"/>
-                <w:sz w:val="17"/>
-              </w:rPr>
-              <w:t>What it is</w:t>
-            </w:r>
-          </w:p>
-        </w:tc>
-        <w:tc>
-          <w:tcPr>
-            <w:tcW w:type="dxa" w:w="4479"/>
-            <w:shd w:val="clear" w:fill="0E2A47"/>
-          </w:tcPr>
-          <w:p>
-            <w:r/>
-            <w:r>
-              <w:rPr>
-                <w:rFonts w:ascii="Calibri" w:hAnsi="Calibri" w:eastAsia="Calibri"/>
-                <w:b/>
-                <w:color w:val="FFFFFF"/>
-                <w:sz w:val="17"/>
-              </w:rPr>
-              <w:t>What is inside</w:t>
+              <w:t>—</w:t>
             </w:r>
           </w:p>
         </w:tc>
@@ -659,7 +537,7 @@
                 <w:rFonts w:ascii="Calibri" w:hAnsi="Calibri" w:eastAsia="Calibri"/>
                 <w:sz w:val="17"/>
               </w:rPr>
-              <w:t>File_Guide.docx</w:t>
+              <w:t>File_Guide_CN.docx</w:t>
             </w:r>
           </w:p>
         </w:tc>
@@ -674,7 +552,7 @@
                 <w:rFonts w:ascii="Calibri" w:hAnsi="Calibri" w:eastAsia="Calibri"/>
                 <w:sz w:val="17"/>
               </w:rPr>
-              <w:t>42 KB</w:t>
+              <w:t>43 KB</w:t>
             </w:r>
           </w:p>
         </w:tc>
@@ -721,7 +599,7 @@
                 <w:rFonts w:ascii="Calibri" w:hAnsi="Calibri" w:eastAsia="Calibri"/>
                 <w:sz w:val="17"/>
               </w:rPr>
-              <w:t>File_Guide.pdf</w:t>
+              <w:t>File_Guide_CN.pdf</w:t>
             </w:r>
           </w:p>
         </w:tc>
@@ -736,7 +614,7 @@
                 <w:rFonts w:ascii="Calibri" w:hAnsi="Calibri" w:eastAsia="Calibri"/>
                 <w:sz w:val="17"/>
               </w:rPr>
-              <w:t>201 KB</w:t>
+              <w:t>394 KB</w:t>
             </w:r>
           </w:p>
         </w:tc>
@@ -783,7 +661,7 @@
                 <w:rFonts w:ascii="Calibri" w:hAnsi="Calibri" w:eastAsia="Calibri"/>
                 <w:sz w:val="17"/>
               </w:rPr>
-              <w:t>File_Guide_CN.docx</w:t>
+              <w:t>README.md</w:t>
             </w:r>
           </w:p>
         </w:tc>
@@ -798,7 +676,7 @@
                 <w:rFonts w:ascii="Calibri" w:hAnsi="Calibri" w:eastAsia="Calibri"/>
                 <w:sz w:val="17"/>
               </w:rPr>
-              <w:t>43 KB</w:t>
+              <w:t>1 KB</w:t>
             </w:r>
           </w:p>
         </w:tc>
@@ -813,7 +691,7 @@
                 <w:rFonts w:ascii="Calibri" w:hAnsi="Calibri" w:eastAsia="Calibri"/>
                 <w:sz w:val="17"/>
               </w:rPr>
-              <w:t>—</w:t>
+              <w:t>Quick orientation</w:t>
             </w:r>
           </w:p>
         </w:tc>
@@ -828,69 +706,7 @@
                 <w:rFonts w:ascii="Calibri" w:hAnsi="Calibri" w:eastAsia="Calibri"/>
                 <w:sz w:val="17"/>
               </w:rPr>
-              <w:t>—</w:t>
-            </w:r>
-          </w:p>
-        </w:tc>
-      </w:tr>
-      <w:tr>
-        <w:tc>
-          <w:tcPr>
-            <w:tcW w:type="dxa" w:w="3061"/>
-          </w:tcPr>
-          <w:p>
-            <w:r/>
-            <w:r>
-              <w:rPr>
-                <w:rFonts w:ascii="Calibri" w:hAnsi="Calibri" w:eastAsia="Calibri"/>
-                <w:sz w:val="17"/>
-              </w:rPr>
-              <w:t>File_Guide_CN.pdf</w:t>
-            </w:r>
-          </w:p>
-        </w:tc>
-        <w:tc>
-          <w:tcPr>
-            <w:tcW w:type="dxa" w:w="737"/>
-          </w:tcPr>
-          <w:p>
-            <w:r/>
-            <w:r>
-              <w:rPr>
-                <w:rFonts w:ascii="Calibri" w:hAnsi="Calibri" w:eastAsia="Calibri"/>
-                <w:sz w:val="17"/>
-              </w:rPr>
-              <w:t>396 KB</w:t>
-            </w:r>
-          </w:p>
-        </w:tc>
-        <w:tc>
-          <w:tcPr>
-            <w:tcW w:type="dxa" w:w="2268"/>
-          </w:tcPr>
-          <w:p>
-            <w:r/>
-            <w:r>
-              <w:rPr>
-                <w:rFonts w:ascii="Calibri" w:hAnsi="Calibri" w:eastAsia="Calibri"/>
-                <w:sz w:val="17"/>
-              </w:rPr>
-              <w:t>—</w:t>
-            </w:r>
-          </w:p>
-        </w:tc>
-        <w:tc>
-          <w:tcPr>
-            <w:tcW w:type="dxa" w:w="4479"/>
-          </w:tcPr>
-          <w:p>
-            <w:r/>
-            <w:r>
-              <w:rPr>
-                <w:rFonts w:ascii="Calibri" w:hAnsi="Calibri" w:eastAsia="Calibri"/>
-                <w:sz w:val="17"/>
-              </w:rPr>
-              <w:t>—</w:t>
+              <w:t>Three sentences on what the package is and where to start.</w:t>
             </w:r>
           </w:p>
         </w:tc>
@@ -2539,254 +2355,6 @@
                 <w:rFonts w:ascii="Calibri" w:hAnsi="Calibri" w:eastAsia="Calibri"/>
                 <w:sz w:val="17"/>
               </w:rPr>
-              <w:t>Product_Spec_CN.docx</w:t>
-            </w:r>
-          </w:p>
-        </w:tc>
-        <w:tc>
-          <w:tcPr>
-            <w:tcW w:type="dxa" w:w="737"/>
-          </w:tcPr>
-          <w:p>
-            <w:r/>
-            <w:r>
-              <w:rPr>
-                <w:rFonts w:ascii="Calibri" w:hAnsi="Calibri" w:eastAsia="Calibri"/>
-                <w:sz w:val="17"/>
-              </w:rPr>
-              <w:t>42 KB</w:t>
-            </w:r>
-          </w:p>
-        </w:tc>
-        <w:tc>
-          <w:tcPr>
-            <w:tcW w:type="dxa" w:w="2268"/>
-          </w:tcPr>
-          <w:p>
-            <w:r/>
-            <w:r>
-              <w:rPr>
-                <w:rFonts w:ascii="Calibri" w:hAnsi="Calibri" w:eastAsia="Calibri"/>
-                <w:sz w:val="17"/>
-              </w:rPr>
-              <w:t>Product spec (CN)</w:t>
-            </w:r>
-          </w:p>
-        </w:tc>
-        <w:tc>
-          <w:tcPr>
-            <w:tcW w:type="dxa" w:w="4479"/>
-          </w:tcPr>
-          <w:p>
-            <w:r/>
-            <w:r>
-              <w:rPr>
-                <w:rFonts w:ascii="Calibri" w:hAnsi="Calibri" w:eastAsia="Calibri"/>
-                <w:sz w:val="17"/>
-              </w:rPr>
-              <w:t>Positioning, vision, substitutes, scenarios, features, economics, metrics, risks, roadmap.</w:t>
-            </w:r>
-          </w:p>
-        </w:tc>
-      </w:tr>
-      <w:tr>
-        <w:tc>
-          <w:tcPr>
-            <w:tcW w:type="dxa" w:w="3061"/>
-          </w:tcPr>
-          <w:p>
-            <w:r/>
-            <w:r>
-              <w:rPr>
-                <w:rFonts w:ascii="Calibri" w:hAnsi="Calibri" w:eastAsia="Calibri"/>
-                <w:sz w:val="17"/>
-              </w:rPr>
-              <w:t>Product_Spec_CN.md</w:t>
-            </w:r>
-          </w:p>
-        </w:tc>
-        <w:tc>
-          <w:tcPr>
-            <w:tcW w:type="dxa" w:w="737"/>
-          </w:tcPr>
-          <w:p>
-            <w:r/>
-            <w:r>
-              <w:rPr>
-                <w:rFonts w:ascii="Calibri" w:hAnsi="Calibri" w:eastAsia="Calibri"/>
-                <w:sz w:val="17"/>
-              </w:rPr>
-              <w:t>8 KB</w:t>
-            </w:r>
-          </w:p>
-        </w:tc>
-        <w:tc>
-          <w:tcPr>
-            <w:tcW w:type="dxa" w:w="2268"/>
-          </w:tcPr>
-          <w:p>
-            <w:r/>
-            <w:r>
-              <w:rPr>
-                <w:rFonts w:ascii="Calibri" w:hAnsi="Calibri" w:eastAsia="Calibri"/>
-                <w:sz w:val="17"/>
-              </w:rPr>
-              <w:t>Product spec source (CN)</w:t>
-            </w:r>
-          </w:p>
-        </w:tc>
-        <w:tc>
-          <w:tcPr>
-            <w:tcW w:type="dxa" w:w="4479"/>
-          </w:tcPr>
-          <w:p>
-            <w:r/>
-            <w:r>
-              <w:rPr>
-                <w:rFonts w:ascii="Calibri" w:hAnsi="Calibri" w:eastAsia="Calibri"/>
-                <w:sz w:val="17"/>
-              </w:rPr>
-              <w:t>The same document as Markdown.</w:t>
-            </w:r>
-          </w:p>
-        </w:tc>
-      </w:tr>
-      <w:tr>
-        <w:tc>
-          <w:tcPr>
-            <w:tcW w:type="dxa" w:w="3061"/>
-          </w:tcPr>
-          <w:p>
-            <w:r/>
-            <w:r>
-              <w:rPr>
-                <w:rFonts w:ascii="Calibri" w:hAnsi="Calibri" w:eastAsia="Calibri"/>
-                <w:sz w:val="17"/>
-              </w:rPr>
-              <w:t>Product_Spec_EN.docx</w:t>
-            </w:r>
-          </w:p>
-        </w:tc>
-        <w:tc>
-          <w:tcPr>
-            <w:tcW w:type="dxa" w:w="737"/>
-          </w:tcPr>
-          <w:p>
-            <w:r/>
-            <w:r>
-              <w:rPr>
-                <w:rFonts w:ascii="Calibri" w:hAnsi="Calibri" w:eastAsia="Calibri"/>
-                <w:sz w:val="17"/>
-              </w:rPr>
-              <w:t>41 KB</w:t>
-            </w:r>
-          </w:p>
-        </w:tc>
-        <w:tc>
-          <w:tcPr>
-            <w:tcW w:type="dxa" w:w="2268"/>
-          </w:tcPr>
-          <w:p>
-            <w:r/>
-            <w:r>
-              <w:rPr>
-                <w:rFonts w:ascii="Calibri" w:hAnsi="Calibri" w:eastAsia="Calibri"/>
-                <w:sz w:val="17"/>
-              </w:rPr>
-              <w:t>Product spec (EN)</w:t>
-            </w:r>
-          </w:p>
-        </w:tc>
-        <w:tc>
-          <w:tcPr>
-            <w:tcW w:type="dxa" w:w="4479"/>
-          </w:tcPr>
-          <w:p>
-            <w:r/>
-            <w:r>
-              <w:rPr>
-                <w:rFonts w:ascii="Calibri" w:hAnsi="Calibri" w:eastAsia="Calibri"/>
-                <w:sz w:val="17"/>
-              </w:rPr>
-              <w:t>The same document in English.</w:t>
-            </w:r>
-          </w:p>
-        </w:tc>
-      </w:tr>
-      <w:tr>
-        <w:tc>
-          <w:tcPr>
-            <w:tcW w:type="dxa" w:w="3061"/>
-          </w:tcPr>
-          <w:p>
-            <w:r/>
-            <w:r>
-              <w:rPr>
-                <w:rFonts w:ascii="Calibri" w:hAnsi="Calibri" w:eastAsia="Calibri"/>
-                <w:sz w:val="17"/>
-              </w:rPr>
-              <w:t>Product_Spec_EN.md</w:t>
-            </w:r>
-          </w:p>
-        </w:tc>
-        <w:tc>
-          <w:tcPr>
-            <w:tcW w:type="dxa" w:w="737"/>
-          </w:tcPr>
-          <w:p>
-            <w:r/>
-            <w:r>
-              <w:rPr>
-                <w:rFonts w:ascii="Calibri" w:hAnsi="Calibri" w:eastAsia="Calibri"/>
-                <w:sz w:val="17"/>
-              </w:rPr>
-              <w:t>8 KB</w:t>
-            </w:r>
-          </w:p>
-        </w:tc>
-        <w:tc>
-          <w:tcPr>
-            <w:tcW w:type="dxa" w:w="2268"/>
-          </w:tcPr>
-          <w:p>
-            <w:r/>
-            <w:r>
-              <w:rPr>
-                <w:rFonts w:ascii="Calibri" w:hAnsi="Calibri" w:eastAsia="Calibri"/>
-                <w:sz w:val="17"/>
-              </w:rPr>
-              <w:t>Product spec source (EN)</w:t>
-            </w:r>
-          </w:p>
-        </w:tc>
-        <w:tc>
-          <w:tcPr>
-            <w:tcW w:type="dxa" w:w="4479"/>
-          </w:tcPr>
-          <w:p>
-            <w:r/>
-            <w:r>
-              <w:rPr>
-                <w:rFonts w:ascii="Calibri" w:hAnsi="Calibri" w:eastAsia="Calibri"/>
-                <w:sz w:val="17"/>
-              </w:rPr>
-              <w:t>The same document as Markdown.</w:t>
-            </w:r>
-          </w:p>
-        </w:tc>
-      </w:tr>
-      <w:tr>
-        <w:tc>
-          <w:tcPr>
-            <w:tcW w:type="dxa" w:w="3061"/>
-          </w:tcPr>
-          <w:p>
-            <w:r/>
-            <w:r>
-              <w:rPr>
-                <w:rFonts w:ascii="Calibri" w:hAnsi="Calibri" w:eastAsia="Calibri"/>
-                <w:sz w:val="17"/>
-              </w:rPr>
               <w:t>Relational_Schema.md</w:t>
             </w:r>
           </w:p>
@@ -6466,7 +6034,7 @@
                 <w:rFonts w:ascii="Calibri" w:hAnsi="Calibri" w:eastAsia="Calibri"/>
                 <w:sz w:val="17"/>
               </w:rPr>
-              <w:t>273 KB</w:t>
+              <w:t>274 KB</w:t>
             </w:r>
           </w:p>
         </w:tc>

</xml_diff>